<commit_message>
docs: realign noslop to StoryScope paper + human flow
Ship bar is readable page finish, not VOICE/StoryScope max. Paper one-pager,
genre split (long fiction construction vs short anti-glue), balanced default,
max research-only. Modes report + tests enforce flow-over-score.
</commit_message>
<xml_diff>
--- a/evals/results/noslop_modes_comparison.docx
+++ b/evals/results/noslop_modes_comparison.docx
@@ -31,7 +31,7 @@
           <w:sz w:val="20"/>
           <w:szCs w:val="20"/>
         </w:rPr>
-        <w:t xml:space="preserve">Human flow over score maxing. Same briefs, four intensities. VOICE scores from the real noslop CLI path. StoryScope not required; book-band scores (~0.1–0.3) can still mean good writing.</w:t>
+        <w:t xml:space="preserve">Paper: StoryScope (arXiv:2604.03136) — discourse construction on fiction (theme over-explain, tidy single-track vs moral ambiguity, temporal complexity, diversity). Ship bar = careful human finishes the page. VOICE is soft anti-glue only; numbers are not flow ranking.</w:t>
       </w:r>
     </w:p>
     <w:p>
@@ -64,7 +64,24 @@
           <w:sz w:val="22"/>
           <w:szCs w:val="22"/>
         </w:rPr>
-        <w:t xml:space="preserve">When we max VOICE or StoryScope feature packs, numbers climb and the page often gets stiff: checklist craft, even completion, every beat pays off. Real books can sit near ~0.13 P(human) on StoryScope and still flow. High metric + low readability is failure. This report compares modes so we stop shipping “max” as if it were “best.”</w:t>
+        <w:t xml:space="preserve">We lost the plot: checklist craft + max VOICE/StoryScope produced high numbers and stiff pages. StoryScope measured how stories are built on ~5k-word fiction, with features extracted then classified — not forged to raise P(human). Books can sit near ~0.13–0.27 P(human) and still flow. High metric + low readability is failure. This report compares modes so we stop shipping “max” as if it were “best.”</w:t>
+      </w:r>
+    </w:p>
+    <w:p>
+      <w:pPr>
+        <w:spacing w:after="160"/>
+      </w:pPr>
+      <w:r>
+        <w:rPr>
+          <w:rFonts w:ascii="Arial" w:cs="Arial" w:eastAsia="Arial" w:hAnsi="Arial"/>
+          <w:b w:val="false"/>
+          <w:bCs w:val="false"/>
+          <w:i w:val="false"/>
+          <w:iCs w:val="false"/>
+          <w:sz w:val="22"/>
+          <w:szCs w:val="22"/>
+        </w:rPr>
+        <w:t xml:space="preserve">Genre split: long fiction gets paper construction (less theme dump, greyer choices, time texture when length allows). Short agent prose gets flow + anti-glue — do not force novel toys on emails.</w:t>
       </w:r>
     </w:p>
     <w:p>
@@ -148,7 +165,7 @@
           <w:sz w:val="22"/>
           <w:szCs w:val="22"/>
         </w:rPr>
-        <w:t xml:space="preserve">max — Research only. Full craft pressure (dense anchors, stamp-ready unevenness, optional StoryScope toys). Document the readability cost.</w:t>
+        <w:t xml:space="preserve">max — Research only. Full craft pressure (frame/turn/aftermath stamps, dense checklist). Document the readability cost. Not the product path even if VOICE is highest.</w:t>
       </w:r>
     </w:p>
     <w:p>
@@ -164,7 +181,7 @@
           <w:sz w:val="32"/>
           <w:szCs w:val="32"/>
         </w:rPr>
-        <w:t xml:space="preserve">3. VOICE scores</w:t>
+        <w:t xml:space="preserve">3. VOICE scores (not flow ranking)</w:t>
       </w:r>
     </w:p>
     <w:p>
@@ -181,7 +198,7 @@
           <w:sz w:val="20"/>
           <w:szCs w:val="20"/>
         </w:rPr>
-        <w:t xml:space="preserve">Scored with python -m noslop.cli voice / score_voice. Pass threshold for research tables is informative; ship intensity is balanced, not max.</w:t>
+        <w:t xml:space="preserve">Scored with python -m noslop.cli voice / score_voice. Informative only. Ship intensity is balanced, not max. Read drafts — VOICE ≠ human preference.</w:t>
       </w:r>
     </w:p>
     <w:tbl>
@@ -497,7 +514,7 @@
                 <w:sz w:val="18"/>
                 <w:szCs w:val="18"/>
               </w:rPr>
-              <w:t xml:space="preserve">9.12 (pass)</w:t>
+              <w:t xml:space="preserve">7.19 (pass)</w:t>
             </w:r>
           </w:p>
         </w:tc>
@@ -644,7 +661,7 @@
                 <w:sz w:val="18"/>
                 <w:szCs w:val="18"/>
               </w:rPr>
-              <w:t xml:space="preserve">9.12 (pass)</w:t>
+              <w:t xml:space="preserve">8.07 (pass)</w:t>
             </w:r>
           </w:p>
         </w:tc>
@@ -682,7 +699,7 @@
           <w:sz w:val="18"/>
           <w:szCs w:val="18"/>
         </w:rPr>
-        <w:t xml:space="preserve">Note: VOICE is a heuristic. A high modest score (e.g. a short clean email) does not mean max is more human-readable — read the drafts.</w:t>
+        <w:t xml:space="preserve">Note: a high max score does not mean max is more human-readable. Primary judge is whether a careful human finishes the page.</w:t>
       </w:r>
     </w:p>
     <w:p>
@@ -715,7 +732,24 @@
           <w:sz w:val="22"/>
           <w:szCs w:val="22"/>
         </w:rPr>
-        <w:t xml:space="preserve">Ship balanced as the default skill intensity. Use modest for natural letters and low-pressure notes. Use max only when the user asks for research / stress craft — and label it. Never treat the highest VOICE number as the product goal.</w:t>
+        <w:t xml:space="preserve">Ship balanced as the default skill intensity. Use modest for natural letters and low-pressure notes. Use max only when the user asks for research / stress craft — and label it. Never treat the highest VOICE or StoryScope number as the product goal. Do not require P(human) ≥ 0.5. Do not forge features.</w:t>
+      </w:r>
+    </w:p>
+    <w:p>
+      <w:pPr>
+        <w:spacing w:after="160"/>
+      </w:pPr>
+      <w:r>
+        <w:rPr>
+          <w:rFonts w:ascii="Arial" w:cs="Arial" w:eastAsia="Arial" w:hAnsi="Arial"/>
+          <w:b w:val="false"/>
+          <w:bCs w:val="false"/>
+          <w:i w:val="false"/>
+          <w:iCs w:val="false"/>
+          <w:sz w:val="22"/>
+          <w:szCs w:val="22"/>
+        </w:rPr>
+        <w:t xml:space="preserve">Warning against max-as-product: max arms intentionally show craft stamps (“I’m writing this after…”, “Here’s the turn”, aftermath framing). That is research illustration of score-farm stiffness, not the ship recipe.</w:t>
       </w:r>
     </w:p>
     <w:p>
@@ -1066,20 +1100,20 @@
           <w:sz w:val="22"/>
           <w:szCs w:val="22"/>
         </w:rPr>
-        <w:t xml:space="preserve">max (research / craft pressure)  ·  VOICE 9.12  ·  gate=pass</w:t>
-      </w:r>
-    </w:p>
-    <w:p>
-      <w:pPr>
-        <w:spacing w:after="80"/>
-      </w:pPr>
-      <w:r>
-        <w:rPr>
-          <w:rFonts w:ascii="Consolas" w:cs="Consolas" w:eastAsia="Consolas" w:hAnsi="Consolas"/>
-          <w:sz w:val="18"/>
-          <w:szCs w:val="18"/>
-        </w:rPr>
-        <w:t xml:space="preserve">1:14 a.m. Eastbridge food court. Pretzel neon still humming. Blue mesh size 11 under C7 — grit in the tread, name on the tongue rubbed to a black J.</w:t>
+        <w:t xml:space="preserve">max (research / craft pressure — not product)  ·  VOICE 7.19  ·  gate=pass</w:t>
+      </w:r>
+    </w:p>
+    <w:p>
+      <w:pPr>
+        <w:spacing w:after="80"/>
+      </w:pPr>
+      <w:r>
+        <w:rPr>
+          <w:rFonts w:ascii="Consolas" w:cs="Consolas" w:eastAsia="Consolas" w:hAnsi="Consolas"/>
+          <w:sz w:val="18"/>
+          <w:szCs w:val="18"/>
+        </w:rPr>
+        <w:t xml:space="preserve">1:14 a.m. Eastbridge food court. Pretzel neon. Blue mesh size 11 under C7 — grit in the tread, tongue-mark rubbed to a black J.</w:t>
       </w:r>
     </w:p>
     <w:p>
@@ -1131,59 +1165,59 @@
           <w:sz w:val="18"/>
           <w:szCs w:val="18"/>
         </w:rPr>
-        <w:t xml:space="preserve">Didn't call. Loading dock puddle. Bus stop empty after ten. Cart with one frozen wheel. No second shoe.</w:t>
-      </w:r>
-    </w:p>
-    <w:p>
-      <w:pPr>
-        <w:spacing w:after="40"/>
-      </w:pPr>
-      <w:r>
-        <w:rPr>
-          <w:rFonts w:ascii="Consolas" w:cs="Consolas" w:eastAsia="Consolas" w:hAnsi="Consolas"/>
-          <w:sz w:val="18"/>
-          <w:szCs w:val="18"/>
-        </w:rPr>
-        <w:t xml:space="preserve"> </w:t>
-      </w:r>
-    </w:p>
-    <w:p>
-      <w:pPr>
-        <w:spacing w:after="80"/>
-      </w:pPr>
-      <w:r>
-        <w:rPr>
-          <w:rFonts w:ascii="Consolas" w:cs="Consolas" w:eastAsia="Consolas" w:hAnsi="Consolas"/>
-          <w:sz w:val="18"/>
-          <w:szCs w:val="18"/>
-        </w:rPr>
-        <w:t xml:space="preserve">Thursday 6:40 p.m. Anita waves me over. Green coat. Boy, one sock. They left Tuesday mid-fight; daycare called about the missing shoe. I hand the bag over. Pen click. Second log line I never write.</w:t>
-      </w:r>
-    </w:p>
-    <w:p>
-      <w:pPr>
-        <w:spacing w:after="40"/>
-      </w:pPr>
-      <w:r>
-        <w:rPr>
-          <w:rFonts w:ascii="Consolas" w:cs="Consolas" w:eastAsia="Consolas" w:hAnsi="Consolas"/>
-          <w:sz w:val="18"/>
-          <w:szCs w:val="18"/>
-        </w:rPr>
-        <w:t xml:space="preserve"> </w:t>
-      </w:r>
-    </w:p>
-    <w:p>
-      <w:pPr>
-        <w:spacing w:after="80"/>
-      </w:pPr>
-      <w:r>
-        <w:rPr>
-          <w:rFonts w:ascii="Consolas" w:cs="Consolas" w:eastAsia="Consolas" w:hAnsi="Consolas"/>
-          <w:sz w:val="18"/>
-          <w:szCs w:val="18"/>
-        </w:rPr>
-        <w:t xml:space="preserve">Still check C7. Shelf has a gap. Shoulders drop a little. I leave the gap.</w:t>
+        <w:t xml:space="preserve">I'm writing this after the dock walk. Here's the turn people miss: the second shoe never shows. Loading dock puddle. Bus stop empty after ten. Cart with one frozen wheel.</w:t>
+      </w:r>
+    </w:p>
+    <w:p>
+      <w:pPr>
+        <w:spacing w:after="40"/>
+      </w:pPr>
+      <w:r>
+        <w:rPr>
+          <w:rFonts w:ascii="Consolas" w:cs="Consolas" w:eastAsia="Consolas" w:hAnsi="Consolas"/>
+          <w:sz w:val="18"/>
+          <w:szCs w:val="18"/>
+        </w:rPr>
+        <w:t xml:space="preserve"> </w:t>
+      </w:r>
+    </w:p>
+    <w:p>
+      <w:pPr>
+        <w:spacing w:after="80"/>
+      </w:pPr>
+      <w:r>
+        <w:rPr>
+          <w:rFonts w:ascii="Consolas" w:cs="Consolas" w:eastAsia="Consolas" w:hAnsi="Consolas"/>
+          <w:sz w:val="18"/>
+          <w:szCs w:val="18"/>
+        </w:rPr>
+        <w:t xml:space="preserve">Aftermath isn't closure. It's Thursday 6:40 p.m. Anita waves. Green coat. Boy, one sock. They left Tuesday mid-fight; daycare called about the missing shoe. I hand the bag. Pen click. Second log line I never write.</w:t>
+      </w:r>
+    </w:p>
+    <w:p>
+      <w:pPr>
+        <w:spacing w:after="40"/>
+      </w:pPr>
+      <w:r>
+        <w:rPr>
+          <w:rFonts w:ascii="Consolas" w:cs="Consolas" w:eastAsia="Consolas" w:hAnsi="Consolas"/>
+          <w:sz w:val="18"/>
+          <w:szCs w:val="18"/>
+        </w:rPr>
+        <w:t xml:space="preserve"> </w:t>
+      </w:r>
+    </w:p>
+    <w:p>
+      <w:pPr>
+        <w:spacing w:after="80"/>
+      </w:pPr>
+      <w:r>
+        <w:rPr>
+          <w:rFonts w:ascii="Consolas" w:cs="Consolas" w:eastAsia="Consolas" w:hAnsi="Consolas"/>
+          <w:sz w:val="18"/>
+          <w:szCs w:val="18"/>
+        </w:rPr>
+        <w:t xml:space="preserve">Still check C7. Shelf has a gap. Shoulders drop. Theme if you need one: the gap stays. I leave it.</w:t>
       </w:r>
     </w:p>
     <w:p>
@@ -1725,7 +1759,7 @@
           <w:sz w:val="22"/>
           <w:szCs w:val="22"/>
         </w:rPr>
-        <w:t xml:space="preserve">max (research / craft pressure)  ·  VOICE 9.12  ·  gate=pass</w:t>
+        <w:t xml:space="preserve">max (research / craft pressure — not product)  ·  VOICE 8.07  ·  gate=pass</w:t>
       </w:r>
     </w:p>
     <w:p>
@@ -1842,7 +1876,7 @@
           <w:sz w:val="18"/>
           <w:szCs w:val="18"/>
         </w:rPr>
-        <w:t xml:space="preserve">Twist people miss: often not missing patients — double-booked slots marked attended. Tuesday 4:05 I showed that once; ops lead went quiet.</w:t>
+        <w:t xml:space="preserve">Here's the turn: often not missing patients — double-booked slots marked attended. Tuesday 4:05 I showed that once; ops lead went quiet. Aftermath isn't a deck. It's a marked CSV and a quiet inbox.</w:t>
       </w:r>
     </w:p>
     <w:p>
@@ -1970,7 +2004,7 @@
           <w:sz w:val="22"/>
           <w:szCs w:val="22"/>
         </w:rPr>
-        <w:t xml:space="preserve">Drafts: evals/results/modes/*.md  ·  Scores: *_voice.json  ·  SUMMARY.md  ·  Skill: skills/noslop/modes.md</w:t>
+        <w:t xml:space="preserve">Drafts: evals/results/modes/*.md  ·  Scores: *_voice.json  ·  SUMMARY.md  ·  Skill: skills/noslop/modes.md  ·  Paper: skills/noslop/paper.md  ·  arXiv:2604.03136</w:t>
       </w:r>
     </w:p>
     <w:sectPr>
@@ -2102,7 +2136,7 @@
         <w:sz w:val="16"/>
         <w:szCs w:val="16"/>
       </w:rPr>
-      <w:t xml:space="preserve">noslop · modes comparison · human flow over score maxing</w:t>
+      <w:t xml:space="preserve">noslop · modes · paper construction + human flow (not score max)</w:t>
     </w:r>
   </w:p>
 </w:hdr>

</xml_diff>